<commit_message>
feat: add template smart format workflow
</commit_message>
<xml_diff>
--- a/templates/company/technical-file-format-requirements.docx
+++ b/templates/company/technical-file-format-requirements.docx
@@ -52,9 +52,11 @@
               <w:lang w:eastAsia="zh-CN"/>
             </w:rPr>
           </w:pPr>
+          <w:bookmarkStart w:id="87" w:name="_GoBack"/>
+          <w:bookmarkEnd w:id="87"/>
           <w:bookmarkStart w:id="0" w:name="_Toc1747214275"/>
-          <w:bookmarkStart w:id="1" w:name="_Toc476714417"/>
-          <w:bookmarkStart w:id="2" w:name="_Toc281648839"/>
+          <w:bookmarkStart w:id="1" w:name="_Toc281648839"/>
+          <w:bookmarkStart w:id="2" w:name="_Toc476714417"/>
           <w:r>
             <w:rPr>
               <w:rFonts w:hint="default" w:ascii="Times New Roman" w:hAnsi="Times New Roman" w:eastAsia="黑体" w:cs="Times New Roman"/>
@@ -2027,6 +2029,7 @@
       <w:pPr>
         <w:pStyle w:val="22"/>
         <w:bidi w:val="0"/>
+        <w:outlineLvl w:val="0"/>
         <w:rPr>
           <w:rFonts w:hint="eastAsia"/>
           <w:lang w:eastAsia="zh-CN"/>
@@ -2049,10 +2052,10 @@
         </w:rPr>
       </w:pPr>
       <w:bookmarkStart w:id="3" w:name="_Toc291906602"/>
-      <w:bookmarkStart w:id="4" w:name="_Toc101090338"/>
-      <w:bookmarkStart w:id="5" w:name="_Toc1470922716"/>
-      <w:bookmarkStart w:id="6" w:name="_Toc787496184"/>
-      <w:bookmarkStart w:id="7" w:name="_Toc665573189"/>
+      <w:bookmarkStart w:id="4" w:name="_Toc665573189"/>
+      <w:bookmarkStart w:id="5" w:name="_Toc787496184"/>
+      <w:bookmarkStart w:id="6" w:name="_Toc101090338"/>
+      <w:bookmarkStart w:id="7" w:name="_Toc1470922716"/>
       <w:r>
         <w:rPr>
           <w:rFonts w:hint="default"/>
@@ -2083,15 +2086,7 @@
         <w:rPr>
           <w:rFonts w:hint="default"/>
         </w:rPr>
-        <w:t>，行间距1.25倍，段前</w:t>
-      </w:r>
-      <w:bookmarkStart w:id="87" w:name="_GoBack"/>
-      <w:bookmarkEnd w:id="87"/>
-      <w:r>
-        <w:rPr>
-          <w:rFonts w:hint="default"/>
-        </w:rPr>
-        <w:t>、段后各0.5行</w:t>
+        <w:t>，行间距1.25倍，段前、段后各0.5行</w:t>
       </w:r>
       <w:bookmarkEnd w:id="3"/>
       <w:bookmarkEnd w:id="4"/>
@@ -2107,11 +2102,11 @@
           <w:rFonts w:hint="default"/>
         </w:rPr>
       </w:pPr>
-      <w:bookmarkStart w:id="8" w:name="_Toc1248096577"/>
-      <w:bookmarkStart w:id="9" w:name="_Toc1741034816"/>
-      <w:bookmarkStart w:id="10" w:name="_Toc123435406"/>
-      <w:bookmarkStart w:id="11" w:name="_Toc2060617510"/>
-      <w:bookmarkStart w:id="12" w:name="_Toc1776653497"/>
+      <w:bookmarkStart w:id="8" w:name="_Toc1741034816"/>
+      <w:bookmarkStart w:id="9" w:name="_Toc1248096577"/>
+      <w:bookmarkStart w:id="10" w:name="_Toc1776653497"/>
+      <w:bookmarkStart w:id="11" w:name="_Toc123435406"/>
+      <w:bookmarkStart w:id="12" w:name="_Toc2060617510"/>
       <w:r>
         <w:rPr>
           <w:rFonts w:hint="default"/>
@@ -2172,9 +2167,9 @@
       </w:pPr>
       <w:bookmarkStart w:id="13" w:name="_Toc362787136"/>
       <w:bookmarkStart w:id="14" w:name="_Toc668125575"/>
-      <w:bookmarkStart w:id="15" w:name="_Toc417748836"/>
+      <w:bookmarkStart w:id="15" w:name="_Toc1717894261"/>
       <w:bookmarkStart w:id="16" w:name="_Toc62859347"/>
-      <w:bookmarkStart w:id="17" w:name="_Toc1717894261"/>
+      <w:bookmarkStart w:id="17" w:name="_Toc417748836"/>
       <w:r>
         <w:rPr>
           <w:rFonts w:hint="default"/>
@@ -3122,9 +3117,9 @@
       </w:pPr>
       <w:bookmarkStart w:id="19" w:name="_Toc857656138"/>
       <w:bookmarkStart w:id="20" w:name="_Toc1289196230"/>
-      <w:bookmarkStart w:id="21" w:name="_Toc489644910"/>
-      <w:bookmarkStart w:id="22" w:name="_Toc889403512"/>
-      <w:bookmarkStart w:id="23" w:name="_Toc1612485137"/>
+      <w:bookmarkStart w:id="21" w:name="_Toc1612485137"/>
+      <w:bookmarkStart w:id="22" w:name="_Toc489644910"/>
+      <w:bookmarkStart w:id="23" w:name="_Toc889403512"/>
       <w:r>
         <w:rPr>
           <w:rFonts w:hint="default"/>
@@ -3831,10 +3826,10 @@
           <w:rFonts w:hint="default"/>
         </w:rPr>
       </w:pPr>
-      <w:bookmarkStart w:id="25" w:name="_Toc2133205165"/>
-      <w:bookmarkStart w:id="26" w:name="_Toc849912985"/>
-      <w:bookmarkStart w:id="27" w:name="_Toc747985138"/>
-      <w:bookmarkStart w:id="28" w:name="_Toc1180776240"/>
+      <w:bookmarkStart w:id="25" w:name="_Toc1180776240"/>
+      <w:bookmarkStart w:id="26" w:name="_Toc747985138"/>
+      <w:bookmarkStart w:id="27" w:name="_Toc849912985"/>
+      <w:bookmarkStart w:id="28" w:name="_Toc2133205165"/>
       <w:bookmarkStart w:id="29" w:name="_Toc1401076861"/>
       <w:r>
         <w:rPr>
@@ -4407,8 +4402,8 @@
           <w:lang w:val="en-US" w:eastAsia="zh-CN"/>
         </w:rPr>
       </w:pPr>
-      <w:bookmarkStart w:id="31" w:name="_Toc1291470379"/>
-      <w:bookmarkStart w:id="32" w:name="_Toc1591417193"/>
+      <w:bookmarkStart w:id="31" w:name="_Toc1591417193"/>
+      <w:bookmarkStart w:id="32" w:name="_Toc1291470379"/>
       <w:bookmarkStart w:id="33" w:name="_Toc294336979"/>
       <w:r>
         <w:rPr>
@@ -4592,9 +4587,9 @@
           <w:lang w:val="en-US" w:eastAsia="zh-CN"/>
         </w:rPr>
       </w:pPr>
-      <w:bookmarkStart w:id="36" w:name="_Toc475338441"/>
+      <w:bookmarkStart w:id="36" w:name="_Toc103606770"/>
       <w:bookmarkStart w:id="37" w:name="_Toc490974902"/>
-      <w:bookmarkStart w:id="38" w:name="_Toc103606770"/>
+      <w:bookmarkStart w:id="38" w:name="_Toc475338441"/>
       <w:r>
         <w:rPr>
           <w:rFonts w:hint="eastAsia"/>
@@ -4662,9 +4657,9 @@
           <w:lang w:val="en-US" w:eastAsia="zh-CN"/>
         </w:rPr>
       </w:pPr>
-      <w:bookmarkStart w:id="39" w:name="_Toc872279044"/>
-      <w:bookmarkStart w:id="40" w:name="_Toc2080149920"/>
-      <w:bookmarkStart w:id="41" w:name="_Toc88352757"/>
+      <w:bookmarkStart w:id="39" w:name="_Toc88352757"/>
+      <w:bookmarkStart w:id="40" w:name="_Toc872279044"/>
+      <w:bookmarkStart w:id="41" w:name="_Toc2080149920"/>
       <w:r>
         <w:rPr>
           <w:rFonts w:hint="default"/>
@@ -4692,8 +4687,8 @@
       <w:bookmarkStart w:id="42" w:name="_Toc1040563310"/>
       <w:bookmarkStart w:id="43" w:name="_Toc720533996"/>
       <w:bookmarkStart w:id="44" w:name="_Toc1009397656"/>
-      <w:bookmarkStart w:id="45" w:name="_Toc2084739813"/>
-      <w:bookmarkStart w:id="46" w:name="_Toc1761672189"/>
+      <w:bookmarkStart w:id="45" w:name="_Toc1761672189"/>
+      <w:bookmarkStart w:id="46" w:name="_Toc2084739813"/>
       <w:r>
         <w:rPr>
           <w:rFonts w:hint="default"/>
@@ -5158,9 +5153,9 @@
           <w:lang w:val="en-US" w:eastAsia="zh-CN"/>
         </w:rPr>
       </w:pPr>
-      <w:bookmarkStart w:id="49" w:name="_Toc664791435"/>
-      <w:bookmarkStart w:id="50" w:name="_Toc1054267268"/>
-      <w:bookmarkStart w:id="51" w:name="_Toc1229708347"/>
+      <w:bookmarkStart w:id="49" w:name="_Toc1054267268"/>
+      <w:bookmarkStart w:id="50" w:name="_Toc1229708347"/>
+      <w:bookmarkStart w:id="51" w:name="_Toc664791435"/>
       <w:r>
         <w:rPr>
           <w:rFonts w:hint="default"/>
@@ -5862,9 +5857,9 @@
           <w:lang w:val="en-US" w:eastAsia="zh-CN"/>
         </w:rPr>
       </w:pPr>
-      <w:bookmarkStart w:id="52" w:name="_Toc1758403669"/>
-      <w:bookmarkStart w:id="53" w:name="_Toc567835490"/>
-      <w:bookmarkStart w:id="54" w:name="_Toc1900106209"/>
+      <w:bookmarkStart w:id="52" w:name="_Toc567835490"/>
+      <w:bookmarkStart w:id="53" w:name="_Toc1900106209"/>
+      <w:bookmarkStart w:id="54" w:name="_Toc1758403669"/>
       <w:r>
         <w:rPr>
           <w:rFonts w:hint="default"/>
@@ -6121,9 +6116,9 @@
           <w:lang w:eastAsia="zh-CN"/>
         </w:rPr>
       </w:pPr>
-      <w:bookmarkStart w:id="55" w:name="_Toc1649449163"/>
-      <w:bookmarkStart w:id="56" w:name="_Toc1181827068"/>
-      <w:bookmarkStart w:id="57" w:name="_Toc1252268295"/>
+      <w:bookmarkStart w:id="55" w:name="_Toc1181827068"/>
+      <w:bookmarkStart w:id="56" w:name="_Toc1252268295"/>
+      <w:bookmarkStart w:id="57" w:name="_Toc1649449163"/>
       <w:r>
         <w:rPr>
           <w:rFonts w:hint="eastAsia"/>
@@ -6210,9 +6205,9 @@
           <w:lang w:eastAsia="zh-CN"/>
         </w:rPr>
       </w:pPr>
-      <w:bookmarkStart w:id="58" w:name="_Toc666944901"/>
-      <w:bookmarkStart w:id="59" w:name="_Toc554520477"/>
-      <w:bookmarkStart w:id="60" w:name="_Toc752225315"/>
+      <w:bookmarkStart w:id="58" w:name="_Toc554520477"/>
+      <w:bookmarkStart w:id="59" w:name="_Toc752225315"/>
+      <w:bookmarkStart w:id="60" w:name="_Toc666944901"/>
       <w:r>
         <w:rPr>
           <w:rFonts w:hint="eastAsia"/>
@@ -6253,9 +6248,9 @@
           <w:lang w:eastAsia="zh-CN"/>
         </w:rPr>
       </w:pPr>
-      <w:bookmarkStart w:id="61" w:name="_Toc2026789115"/>
+      <w:bookmarkStart w:id="61" w:name="_Toc1378426798"/>
       <w:bookmarkStart w:id="62" w:name="_Toc1937481325"/>
-      <w:bookmarkStart w:id="63" w:name="_Toc1378426798"/>
+      <w:bookmarkStart w:id="63" w:name="_Toc2026789115"/>
       <w:r>
         <w:rPr>
           <w:rFonts w:hint="default"/>
@@ -6694,8 +6689,8 @@
         </w:rPr>
       </w:pPr>
       <w:bookmarkStart w:id="64" w:name="_Toc327617877"/>
-      <w:bookmarkStart w:id="65" w:name="_Toc868426337"/>
-      <w:bookmarkStart w:id="66" w:name="_Toc10057683"/>
+      <w:bookmarkStart w:id="65" w:name="_Toc10057683"/>
+      <w:bookmarkStart w:id="66" w:name="_Toc868426337"/>
       <w:r>
         <w:rPr>
           <w:rFonts w:hint="default"/>
@@ -7197,9 +7192,9 @@
           <w:lang w:val="en-US" w:eastAsia="zh-CN"/>
         </w:rPr>
       </w:pPr>
-      <w:bookmarkStart w:id="67" w:name="_Toc2126271746"/>
-      <w:bookmarkStart w:id="68" w:name="_Toc2025003044"/>
-      <w:bookmarkStart w:id="69" w:name="_Toc1740420032"/>
+      <w:bookmarkStart w:id="67" w:name="_Toc2025003044"/>
+      <w:bookmarkStart w:id="68" w:name="_Toc1740420032"/>
+      <w:bookmarkStart w:id="69" w:name="_Toc2126271746"/>
       <w:r>
         <w:rPr>
           <w:rFonts w:hint="default"/>
@@ -7599,8 +7594,8 @@
           <w:lang w:val="en-US" w:eastAsia="zh-CN"/>
         </w:rPr>
       </w:pPr>
-      <w:bookmarkStart w:id="71" w:name="_Toc1041469085"/>
-      <w:bookmarkStart w:id="72" w:name="_Toc1740147984"/>
+      <w:bookmarkStart w:id="71" w:name="_Toc1740147984"/>
+      <w:bookmarkStart w:id="72" w:name="_Toc1041469085"/>
       <w:bookmarkStart w:id="73" w:name="_Toc703201926"/>
       <w:r>
         <w:rPr>
@@ -7662,9 +7657,9 @@
         </w:rPr>
       </w:pPr>
       <w:bookmarkStart w:id="74" w:name="_Toc976755963"/>
-      <w:bookmarkStart w:id="75" w:name="_Toc1405682698"/>
-      <w:bookmarkStart w:id="76" w:name="_Toc366791848"/>
-      <w:bookmarkStart w:id="77" w:name="_Toc180566138"/>
+      <w:bookmarkStart w:id="75" w:name="_Toc366791848"/>
+      <w:bookmarkStart w:id="76" w:name="_Toc180566138"/>
+      <w:bookmarkStart w:id="77" w:name="_Toc1405682698"/>
       <w:r>
         <w:rPr>
           <w:rFonts w:hint="eastAsia"/>
@@ -7776,9 +7771,9 @@
           <w:rFonts w:hint="default"/>
         </w:rPr>
       </w:pPr>
-      <w:bookmarkStart w:id="81" w:name="_Toc967036258"/>
+      <w:bookmarkStart w:id="81" w:name="_Toc9626644"/>
       <w:bookmarkStart w:id="82" w:name="_Toc486106291"/>
-      <w:bookmarkStart w:id="83" w:name="_Toc9626644"/>
+      <w:bookmarkStart w:id="83" w:name="_Toc967036258"/>
       <w:bookmarkStart w:id="84" w:name="_Toc798085046"/>
       <w:r>
         <w:rPr>

</xml_diff>